<commit_message>
Fix PDF Cyrillic text (DejaVu Sans fonts) and DOCX cover image aspect ratio
- PDF: Replace Helvetica with DejaVu Sans (TTF) to support Cyrillic characters
- DOCX: Fix hero image aspect ratio (was 650x350, now 400x400 matching 1:1 source)

Co-Authored-By: Claude Opus 4.6 <noreply@anthropic.com>
</commit_message>
<xml_diff>
--- a/MSV-11-Технический-паспорт.docx
+++ b/MSV-11-Технический-паспорт.docx
@@ -231,7 +231,7 @@
       <w:r>
         <w:drawing>
           <wp:inline distT="0" distB="0" distL="0" distR="0">
-            <wp:extent cx="6191250" cy="3333750"/>
+            <wp:extent cx="3810000" cy="3810000"/>
             <wp:effectExtent t="0" r="0" b="0" l="0"/>
             <wp:docPr id="1" name="hero" descr="MSV-11 main view" title="MSV-11"/>
             <wp:cNvGraphicFramePr>
@@ -256,7 +256,7 @@
                   <pic:spPr bwMode="auto">
                     <a:xfrm>
                       <a:off x="0" y="0"/>
-                      <a:ext cx="6191250" cy="3333750"/>
+                      <a:ext cx="3810000" cy="3810000"/>
                     </a:xfrm>
                     <a:prstGeom prst="rect">
                       <a:avLst/>

</xml_diff>